<commit_message>
Localize RAG documents to Vietnamese
</commit_message>
<xml_diff>
--- a/sample_documents/finance_instructions.docx
+++ b/sample_documents/finance_instructions.docx
@@ -7,7 +7,7 @@
         <w:pStyle w:val="Title"/>
       </w:pPr>
       <w:r>
-        <w:t>Corporate Spend &amp; Expense Approvals</w:t>
+        <w:t>Chính sách chi tiêu và phê duyệt chi phí</w:t>
       </w:r>
     </w:p>
     <w:p>
@@ -15,12 +15,12 @@
         <w:pStyle w:val="Heading1"/>
       </w:pPr>
       <w:r>
-        <w:t>1. General Expenditure Policies</w:t>
+        <w:t>1. Nguyên tắc chi tiêu chung</w:t>
       </w:r>
     </w:p>
     <w:p>
       <w:r>
-        <w:t>All corporate expenses must be business-related, documented with itemized receipts, and submitted within 30 days of the transaction. Unreceipted transactions above $25 will not be reimbursed.</w:t>
+        <w:t>Mọi khoản chi của công ty phải phục vụ mục đích công việc, có hóa đơn hoặc chứng từ chi tiết, và được nộp trong vòng 30 ngày kể từ ngày giao dịch. Giao dịch trên 25 USD không có chứng từ sẽ không được hoàn tiền.</w:t>
       </w:r>
     </w:p>
     <w:p>
@@ -28,24 +28,24 @@
         <w:pStyle w:val="Heading1"/>
       </w:pPr>
       <w:r>
-        <w:t>2. Approval Limit Matrix</w:t>
+        <w:t>2. Ma trận hạn mức phê duyệt</w:t>
       </w:r>
     </w:p>
     <w:p>
       <w:r>
-        <w:t>The following limits apply to all departmental purchases:</w:t>
+        <w:t>Các hạn mức sau áp dụng cho mọi khoản mua sắm của bộ phận:</w:t>
         <w:br/>
       </w:r>
       <w:r>
-        <w:t>- Expenses under $500: Department Lead approval required.</w:t>
+        <w:t>- Chi phí dưới 500 USD: cần trưởng nhóm phê duyệt.</w:t>
         <w:br/>
       </w:r>
       <w:r>
-        <w:t>- Expenses from $500 to $5,000: Department Manager approval required.</w:t>
+        <w:t>- Chi phí từ 500 đến 5.000 USD: cần quản lý bộ phận phê duyệt.</w:t>
         <w:br/>
       </w:r>
       <w:r>
-        <w:t>- Expenses above $5,000: CFO or Executive Director approval required.</w:t>
+        <w:t>- Chi phí trên 5.000 USD: cần CFO hoặc giám đốc điều hành phê duyệt.</w:t>
         <w:br/>
       </w:r>
     </w:p>
@@ -54,12 +54,12 @@
         <w:pStyle w:val="Heading1"/>
       </w:pPr>
       <w:r>
-        <w:t>3. Invoice Submission Flow</w:t>
+        <w:t>3. Quy trình gửi hóa đơn</w:t>
       </w:r>
     </w:p>
     <w:p>
       <w:r>
-        <w:t>Invoices from vendors must be sent directly to finance-receipts@enterprise.com. Each invoice must include the Vendor Name, Invoice Number, Amount, Currency, and Issue Date. Payments are processed on a net-30 schedule after final department sign-off.</w:t>
+        <w:t>Hóa đơn từ nhà cung cấp phải được gửi trực tiếp đến finance-receipts@enterprise.com. Mỗi hóa đơn cần có tên nhà cung cấp, số hóa đơn, số tiền, loại tiền tệ và ngày phát hành. Thanh toán được xử lý theo lịch net-30 sau khi bộ phận liên quan xác nhận lần cuối.</w:t>
       </w:r>
     </w:p>
     <w:sectPr>

</xml_diff>